<commit_message>
Simplify the harmonic-mean paragraph and correct its two numbers
One dense sentence carried the whole argument and its arithmetic did not
hold: with precision 0.03 and recall 1, the arithmetic mean is 0.51 and
the harmonic mean 0.058, not 0.52 and 0.05 as written.

Split into four short paragraphs that set up the always-Shooting model,
give its two measures, compare the two means, then state the property
that matters -- the harmonic mean is dominated by whichever measure is
near zero, so F1 cannot be raised by trading one against the other.

Co-Authored-By: Claude Opus 5 <noreply@anthropic.com>
Claude-Session: https://claude.ai/code/session_01LTN1ToAz7S67GVeppJLK8m
</commit_message>
<xml_diff>
--- a/thesis/Report_HUT_VideoAnomaly.docx
+++ b/thesis/Report_HUT_VideoAnomaly.docx
@@ -5075,7 +5075,52 @@
           <w:szCs w:val="28"/>
           <w:rtl w:val="1"/>
         </w:rPr>
-        <w:t>دلیل انتخاب میانگین هماهنگ به جای میانگین حسابی همین است. برای مدلی که همواره تیراندازی می‌گوید، یادآوری برابر یک و دقت حدود ۰٫۰۳ است؛ میانگین حسابی عدد گمراه‌کننده‌ی ۰٫۵۲ می‌دهد در حالی که میانگین هماهنگ ۰٫۰۵ می‌دهد که ارزیابی درستی از چنین مدلی است.</w:t>
+        <w:t>چرا میانگین هماهنگ و نه میانگین ساده؟ یک مثال این را روشن می‌کند. مدلی را در نظر بگیرید که برای هر ویدیو، بدون استثنا، پاسخ «تیراندازی» می‌دهد.</w:t>
+      </w:r>
+    </w:p>
+    <w:p>
+      <w:pPr>
+        <w:bidi w:val="1"/>
+      </w:pPr>
+      <w:r>
+        <w:rPr>
+          <w:rFonts w:ascii="Times New Roman" w:hAnsi="Times New Roman" w:cs="B Nazanin"/>
+          <w:b w:val="0"/>
+          <w:sz w:val="26"/>
+          <w:szCs w:val="28"/>
+          <w:rtl w:val="1"/>
+        </w:rPr>
+        <w:t>چنین مدلی هر ویدیوی تیراندازی را پیدا می‌کند، پس یادآوری آن برابر یک است. ولی همین برچسب را به ویدیوهای دیگر هم می‌دهد، بنابراین از هر صد پیش‌بینی تنها حدود سه مورد درست است و دقت آن نزدیک ۰٫۰۳ می‌ماند.</w:t>
+      </w:r>
+    </w:p>
+    <w:p>
+      <w:pPr>
+        <w:bidi w:val="1"/>
+      </w:pPr>
+      <w:r>
+        <w:rPr>
+          <w:rFonts w:ascii="Times New Roman" w:hAnsi="Times New Roman" w:cs="B Nazanin"/>
+          <w:b w:val="0"/>
+          <w:sz w:val="26"/>
+          <w:szCs w:val="28"/>
+          <w:rtl w:val="1"/>
+        </w:rPr>
+        <w:t>میانگین ساده‌ی این دو عدد ۰٫۵۱ است؛ نمره‌ای متوسط برای مدلی که هیچ کاری انجام نمی‌دهد. میانگین هماهنگ ۰٫۰۶ می‌دهد که ارزیابی درستی است.</w:t>
+      </w:r>
+    </w:p>
+    <w:p>
+      <w:pPr>
+        <w:bidi w:val="1"/>
+      </w:pPr>
+      <w:r>
+        <w:rPr>
+          <w:rFonts w:ascii="Times New Roman" w:hAnsi="Times New Roman" w:cs="B Nazanin"/>
+          <w:b w:val="0"/>
+          <w:sz w:val="26"/>
+          <w:szCs w:val="28"/>
+          <w:rtl w:val="1"/>
+        </w:rPr>
+        <w:t>علت این تفاوت آن است که میانگین هماهنگ تحت سلطه‌ی کوچک‌ترین عدد قرار می‌گیرد: هر یک از دو معیار که نزدیک صفر باشد، کل نتیجه را نزدیک صفر نگه می‌دارد. بنابراین امتیاز اف‑یک را نمی‌توان با قربانی کردن یکی از دو معیار به سود دیگری بالا برد، و همین ویژگی است که آن را برای یک مسئله‌ی نامتوازن مناسب می‌کند.</w:t>
       </w:r>
     </w:p>
     <w:p>

</xml_diff>

<commit_message>
Call the Transformer a مبدل, and restore three deleted subsections
Rename throughout the report, the thesis, the glossary and both decks:
ترنسفورمر -> مبدل. The glossary entries keep the Latin original in their
footnotes, so "مبدل بینایی" still carries Vision Transformer (ViT) and
"سر مبدل" still carries Transformer Head.

The copy that came back was missing 2-9-2 (آمیزش در فضای ویژگی), 2-9-4
(تنظیم لاجیت برای دم بلند) and 3-3-3 (آمیزش و تنظیم لاجیت). Both remain
referenced elsewhere -- the hyperparameter table lists both coefficients
and chapter three reports their combined effect -- so the document
described settings it never introduced. Rebuilt from source, which also
restores sequential numbering; deleting a subsection in Word leaves a
hole because the number is literal text, not a Word list field.

Co-Authored-By: Claude Opus 5 <noreply@anthropic.com>
Claude-Session: https://claude.ai/code/session_01LTN1ToAz7S67GVeppJLK8m
</commit_message>
<xml_diff>
--- a/thesis/Report_HUT_VideoAnomaly.docx
+++ b/thesis/Report_HUT_VideoAnomaly.docx
@@ -500,7 +500,7 @@
           <w:szCs w:val="28"/>
           <w:rtl w:val="1"/>
         </w:rPr>
-        <w:t xml:space="preserve"> یخ‌زده با ویژگی‌های ذخیره‌شده تغییر کرد که زمان هر پیکربندی را از حدود شانزده ساعت به هشتاد ثانیه رساند و امکان آزمایش سیستماتیک را فراهم کرد. روی این پایه، یک سر ترنسفورمر</w:t>
+        <w:t xml:space="preserve"> یخ‌زده با ویژگی‌های ذخیره‌شده تغییر کرد که زمان هر پیکربندی را از حدود شانزده ساعت به هشتاد ثانیه رساند و امکان آزمایش سیستماتیک را فراهم کرد. روی این پایه، یک سر مبدل</w:t>
       </w:r>
       <w:r>
         <w:rPr>
@@ -756,7 +756,7 @@
           <w:szCs w:val="28"/>
           <w:rtl w:val="1"/>
         </w:rPr>
-        <w:t>تشخیص ناهنجاری در ویدیو - یادگیری چندنمونه‌ای - نظارت ضعیف - ترنسفورمر بینایی - خودرمزگذار نقاب‌دار ویدیویی - طبقه‌بندی چندکلاسه - داده‌ی نامتوازن</w:t>
+        <w:t>تشخیص ناهنجاری در ویدیو - یادگیری چندنمونه‌ای - نظارت ضعیف - مبدل بینایی - خودرمزگذار نقاب‌دار ویدیویی - طبقه‌بندی چندکلاسه - داده‌ی نامتوازن</w:t>
       </w:r>
     </w:p>
     <w:p>
@@ -4645,7 +4645,7 @@
           <w:szCs w:val="28"/>
           <w:rtl w:val="1"/>
         </w:rPr>
-        <w:t>تفاوت میان این چهار مورد، در نیت و در بافت رویداد است نه در ظاهر لحظه‌ای صحنه. یک قاب که در آن فردی کالایی را از قفسه برمی‌دارد، بسته به آنکه پیش از آن با اسلحه وارد شده باشد یا نه، به دو کلاس متفاوت تعلق دارد. همین مشاهده، در فصل دوم مستقیماً به طراحی سر ترنسفورمر روی محور زمان می‌انجامد.</w:t>
+        <w:t>تفاوت میان این چهار مورد، در نیت و در بافت رویداد است نه در ظاهر لحظه‌ای صحنه. یک قاب که در آن فردی کالایی را از قفسه برمی‌دارد، بسته به آنکه پیش از آن با اسلحه وارد شده باشد یا نه، به دو کلاس متفاوت تعلق دارد. همین مشاهده، در فصل دوم مستقیماً به طراحی سر مبدل روی محور زمان می‌انجامد.</w:t>
       </w:r>
     </w:p>
     <w:p>
@@ -5593,7 +5593,7 @@
           <w:szCs w:val="26"/>
           <w:rtl w:val="1"/>
         </w:rPr>
-        <w:t>شکل ۱-۱  خط لوله‌ی نهایی: استخراج ویژگی با رمزگذار یخ‌زده، سر ترنسفورمر روی محور زمان، و تصمیم دومرحله‌ای در زمان استنتاج</w:t>
+        <w:t>شکل ۱-۱  خط لوله‌ی نهایی: استخراج ویژگی با رمزگذار یخ‌زده، سر مبدل روی محور زمان، و تصمیم دومرحله‌ای در زمان استنتاج</w:t>
       </w:r>
     </w:p>
     <w:p>
@@ -7153,7 +7153,7 @@
           <w:szCs w:val="32"/>
           <w:rtl w:val="1"/>
         </w:rPr>
-        <w:t>۲-۷ سر ترنسفورمر روی محور زمان</w:t>
+        <w:t>۲-۷ سر مبدل روی محور زمان</w:t>
       </w:r>
     </w:p>
     <w:p>
@@ -7428,7 +7428,7 @@
           <w:szCs w:val="26"/>
           <w:rtl w:val="1"/>
         </w:rPr>
-        <w:t>جدول ۲-۳  پیکربندی سر ترنسفورمر</w:t>
+        <w:t>جدول ۲-۳  پیکربندی سر مبدل</w:t>
       </w:r>
     </w:p>
     <w:tbl>
@@ -7886,7 +7886,7 @@
           <w:szCs w:val="26"/>
           <w:rtl w:val="1"/>
         </w:rPr>
-        <w:t>جدول ۲-۴  تفکیک پارامترهای آموزش‌پذیر سر ترنسفورمر</w:t>
+        <w:t>جدول ۲-۴  تفکیک پارامترهای آموزش‌پذیر سر مبدل</w:t>
       </w:r>
     </w:p>
     <w:tbl>
@@ -8122,7 +8122,7 @@
                 <w:szCs w:val="26"/>
                 <w:rtl w:val="1"/>
               </w:rPr>
-              <w:t>دو لایه‌ی ترنسفورمر</w:t>
+              <w:t>دو لایه‌ی مبدل</w:t>
             </w:r>
           </w:p>
         </w:tc>
@@ -8318,7 +8318,7 @@
           <w:szCs w:val="28"/>
           <w:rtl w:val="1"/>
         </w:rPr>
-        <w:t>. پس از افزودن سر ترنسفورمر، ماتریس درهم‌ریختگی بررسی شد و معلوم شد خطاهای باقی‌مانده همچنان در خوشه‌ی دزدی متمرکزند: دزدی از مغازه به جای سرقت، و سرقت از منزل به جای سرقت.</w:t>
+        <w:t>. پس از افزودن سر مبدل، ماتریس درهم‌ریختگی بررسی شد و معلوم شد خطاهای باقی‌مانده همچنان در خوشه‌ی دزدی متمرکزند: دزدی از مغازه به جای سرقت، و سرقت از منزل به جای سرقت.</w:t>
       </w:r>
     </w:p>
     <w:p>
@@ -8333,7 +8333,7 @@
           <w:szCs w:val="28"/>
           <w:rtl w:val="1"/>
         </w:rPr>
-        <w:t>این مشاهده، دو توضیح ممکن داشت و هر دو کنار گذاشته شدند. توضیح نخست، نبود بافت زمانی بود؛ ولی سر ترنسفورمر دقیقاً همین را افزوده بود و خطا باقی مانده بود. توضیح دوم، نزدیکی توصیف‌های متنی این کلاس‌ها بود؛ ولی اندازه‌گیری نشان داد این جفت‌ها در فضای متن با کسینوس ۰٫۷۱ و ۰٫۶۷ به‌خوبی از هم جدا هستند.</w:t>
+        <w:t>این مشاهده، دو توضیح ممکن داشت و هر دو کنار گذاشته شدند. توضیح نخست، نبود بافت زمانی بود؛ ولی سر مبدل دقیقاً همین را افزوده بود و خطا باقی مانده بود. توضیح دوم، نزدیکی توصیف‌های متنی این کلاس‌ها بود؛ ولی اندازه‌گیری نشان داد این جفت‌ها در فضای متن با کسینوس ۰٫۷۱ و ۰٫۶۷ به‌خوبی از هم جدا هستند.</w:t>
       </w:r>
     </w:p>
     <w:p>
@@ -8727,7 +8727,7 @@
           <w:szCs w:val="28"/>
           <w:rtl w:val="1"/>
         </w:rPr>
-        <w:t>دومین سازوکار منظم‌سازی، حذف تصادفی با نرخ ۰٫۳ است که در هر دو لایه‌ی ترنسفورمر و پیش از طبقه‌بند نهایی اعمال می‌شود. در هر عبور آموزشی، سی درصد از واحدها به‌طور تصادفی خاموش می‌شوند.</w:t>
+        <w:t>دومین سازوکار منظم‌سازی، حذف تصادفی با نرخ ۰٫۳ است که در هر دو لایه‌ی مبدل و پیش از طبقه‌بند نهایی اعمال می‌شود. در هر عبور آموزشی، سی درصد از واحدها به‌طور تصادفی خاموش می‌شوند.</w:t>
       </w:r>
     </w:p>
     <w:p>
@@ -14476,7 +14476,7 @@
           <w:szCs w:val="28"/>
           <w:rtl w:val="1"/>
         </w:rPr>
-        <w:t>۳. جایگزینی سر نقطه‌ای با سر ترنسفورمر روی محور زمان، بر پایه‌ی تحلیل خطا و نه جستجوی کور.</w:t>
+        <w:t>۳. جایگزینی سر نقطه‌ای با سر مبدل روی محور زمان، بر پایه‌ی تحلیل خطا و نه جستجوی کور.</w:t>
       </w:r>
     </w:p>
     <w:p>

</xml_diff>